<commit_message>
POO S4 (Constructores + toString/equals/hashCode): profundizacion rigurosa
</commit_message>
<xml_diff>
--- a/04-week/optional-activity/pdf/Actividad-Semana04.docx
+++ b/04-week/optional-activity/pdf/Actividad-Semana04.docx
@@ -31,7 +31,7 @@
           <w:sz w:val="22"/>
           <w:szCs w:val="22"/>
         </w:rPr>
-        <w:t xml:space="preserve">Programación y Diseño Orientado a Objetos · Semana 4 · Clase con constructores y toString</w:t>
+        <w:t xml:space="preserve">Programación y Diseño Orientado a Objetos · Semana 4 · Clase con constructores, toString e igualdad</w:t>
       </w:r>
     </w:p>
     <w:tbl>
@@ -430,7 +430,7 @@
           <w:sz w:val="22"/>
           <w:szCs w:val="22"/>
         </w:rPr>
-        <w:t xml:space="preserve">Definir constructores (por defecto y parametrizado).</w:t>
+        <w:t xml:space="preserve">Definir constructores (por defecto y parametrizado) con this() y validación.</w:t>
       </w:r>
     </w:p>
     <w:p>
@@ -478,7 +478,7 @@
           <w:sz w:val="22"/>
           <w:szCs w:val="22"/>
         </w:rPr>
-        <w:t xml:space="preserve">Instanciar objetos en una sola línea y mostrarlos.</w:t>
+        <w:t xml:space="preserve">Implementar equals y hashCode respetando su contrato.</w:t>
       </w:r>
     </w:p>
     <w:p>
@@ -548,6 +548,42 @@
           <w:sz w:val="22"/>
           <w:szCs w:val="22"/>
         </w:rPr>
+        <w:t xml:space="preserve">codigo</w:t>
+      </w:r>
+      <w:r>
+        <w:rPr>
+          <w:rFonts w:ascii="Times New Roman" w:hAnsi="Times New Roman" w:cs="Times New Roman"/>
+          <w:color w:val="000000"/>
+          <w:sz w:val="22"/>
+          <w:szCs w:val="22"/>
+        </w:rPr>
+        <w:t xml:space="preserve"> (solo lectura, </w:t>
+      </w:r>
+      <w:r>
+        <w:rPr>
+          <w:rFonts w:ascii="Consolas" w:hAnsi="Consolas" w:cs="Consolas"/>
+          <w:color w:val="000000"/>
+          <w:sz w:val="22"/>
+          <w:szCs w:val="22"/>
+        </w:rPr>
+        <w:t xml:space="preserve">final</w:t>
+      </w:r>
+      <w:r>
+        <w:rPr>
+          <w:rFonts w:ascii="Times New Roman" w:hAnsi="Times New Roman" w:cs="Times New Roman"/>
+          <w:color w:val="000000"/>
+          <w:sz w:val="22"/>
+          <w:szCs w:val="22"/>
+        </w:rPr>
+        <w:t xml:space="preserve">), </w:t>
+      </w:r>
+      <w:r>
+        <w:rPr>
+          <w:rFonts w:ascii="Consolas" w:hAnsi="Consolas" w:cs="Consolas"/>
+          <w:color w:val="000000"/>
+          <w:sz w:val="22"/>
+          <w:szCs w:val="22"/>
+        </w:rPr>
         <w:t xml:space="preserve">nombre</w:t>
       </w:r>
       <w:r>
@@ -613,30 +649,21 @@
       <w:r>
         <w:rPr>
           <w:rFonts w:ascii="Times New Roman" w:hAnsi="Times New Roman" w:cs="Times New Roman"/>
-          <w:color w:val="000000"/>
-          <w:sz w:val="22"/>
-          <w:szCs w:val="22"/>
-        </w:rPr>
-        <w:t xml:space="preserve">Agrega </w:t>
-      </w:r>
-      <w:r>
-        <w:rPr>
-          <w:rFonts w:ascii="Times New Roman" w:hAnsi="Times New Roman" w:cs="Times New Roman"/>
           <w:b/>
           <w:color w:val="000000"/>
           <w:sz w:val="22"/>
           <w:szCs w:val="22"/>
         </w:rPr>
-        <w:t xml:space="preserve">dos constructores</w:t>
-      </w:r>
-      <w:r>
-        <w:rPr>
-          <w:rFonts w:ascii="Times New Roman" w:hAnsi="Times New Roman" w:cs="Times New Roman"/>
-          <w:color w:val="000000"/>
-          <w:sz w:val="22"/>
-          <w:szCs w:val="22"/>
-        </w:rPr>
-        <w:t xml:space="preserve">: uno vacío y uno con los tres parámetros (usa </w:t>
+        <w:t xml:space="preserve">Constructores:</w:t>
+      </w:r>
+      <w:r>
+        <w:rPr>
+          <w:rFonts w:ascii="Times New Roman" w:hAnsi="Times New Roman" w:cs="Times New Roman"/>
+          <w:color w:val="000000"/>
+          <w:sz w:val="22"/>
+          <w:szCs w:val="22"/>
+        </w:rPr>
+        <w:t xml:space="preserve"> uno completo (con validación </w:t>
       </w:r>
       <w:r>
         <w:rPr>
@@ -645,16 +672,89 @@
           <w:sz w:val="22"/>
           <w:szCs w:val="22"/>
         </w:rPr>
-        <w:t xml:space="preserve">this()</w:t>
-      </w:r>
-      <w:r>
-        <w:rPr>
-          <w:rFonts w:ascii="Times New Roman" w:hAnsi="Times New Roman" w:cs="Times New Roman"/>
-          <w:color w:val="000000"/>
-          <w:sz w:val="22"/>
-          <w:szCs w:val="22"/>
-        </w:rPr>
-        <w:t xml:space="preserve">).</w:t>
+        <w:t xml:space="preserve">precio &gt;= 0</w:t>
+      </w:r>
+      <w:r>
+        <w:rPr>
+          <w:rFonts w:ascii="Times New Roman" w:hAnsi="Times New Roman" w:cs="Times New Roman"/>
+          <w:color w:val="000000"/>
+          <w:sz w:val="22"/>
+          <w:szCs w:val="22"/>
+        </w:rPr>
+        <w:t xml:space="preserve">, </w:t>
+      </w:r>
+      <w:r>
+        <w:rPr>
+          <w:rFonts w:ascii="Consolas" w:hAnsi="Consolas" w:cs="Consolas"/>
+          <w:color w:val="000000"/>
+          <w:sz w:val="22"/>
+          <w:szCs w:val="22"/>
+        </w:rPr>
+        <w:t xml:space="preserve">stock &gt;= 0</w:t>
+      </w:r>
+      <w:r>
+        <w:rPr>
+          <w:rFonts w:ascii="Times New Roman" w:hAnsi="Times New Roman" w:cs="Times New Roman"/>
+          <w:color w:val="000000"/>
+          <w:sz w:val="22"/>
+          <w:szCs w:val="22"/>
+        </w:rPr>
+        <w:t xml:space="preserve">) y uno que reciba solo </w:t>
+      </w:r>
+      <w:r>
+        <w:rPr>
+          <w:rFonts w:ascii="Consolas" w:hAnsi="Consolas" w:cs="Consolas"/>
+          <w:color w:val="000000"/>
+          <w:sz w:val="22"/>
+          <w:szCs w:val="22"/>
+        </w:rPr>
+        <w:t xml:space="preserve">codigo</w:t>
+      </w:r>
+      <w:r>
+        <w:rPr>
+          <w:rFonts w:ascii="Times New Roman" w:hAnsi="Times New Roman" w:cs="Times New Roman"/>
+          <w:color w:val="000000"/>
+          <w:sz w:val="22"/>
+          <w:szCs w:val="22"/>
+        </w:rPr>
+        <w:t xml:space="preserve"> y </w:t>
+      </w:r>
+      <w:r>
+        <w:rPr>
+          <w:rFonts w:ascii="Consolas" w:hAnsi="Consolas" w:cs="Consolas"/>
+          <w:color w:val="000000"/>
+          <w:sz w:val="22"/>
+          <w:szCs w:val="22"/>
+        </w:rPr>
+        <w:t xml:space="preserve">nombre</w:t>
+      </w:r>
+      <w:r>
+        <w:rPr>
+          <w:rFonts w:ascii="Times New Roman" w:hAnsi="Times New Roman" w:cs="Times New Roman"/>
+          <w:color w:val="000000"/>
+          <w:sz w:val="22"/>
+          <w:szCs w:val="22"/>
+        </w:rPr>
+        <w:t xml:space="preserve"> y </w:t>
+      </w:r>
+      <w:r>
+        <w:rPr>
+          <w:rFonts w:ascii="Times New Roman" w:hAnsi="Times New Roman" w:cs="Times New Roman"/>
+          <w:b/>
+          <w:color w:val="000000"/>
+          <w:sz w:val="22"/>
+          <w:szCs w:val="22"/>
+        </w:rPr>
+        <w:t xml:space="preserve">delegue con `this()`</w:t>
+      </w:r>
+      <w:r>
+        <w:rPr>
+          <w:rFonts w:ascii="Times New Roman" w:hAnsi="Times New Roman" w:cs="Times New Roman"/>
+          <w:color w:val="000000"/>
+          <w:sz w:val="22"/>
+          <w:szCs w:val="22"/>
+        </w:rPr>
+        <w:t xml:space="preserve"> en el completo (precio y stock en 0).</w:t>
       </w:r>
     </w:p>
     <w:p>
@@ -673,30 +773,39 @@
       </w:r>
       <w:r>
         <w:rPr>
-          <w:rFonts w:ascii="Times New Roman" w:hAnsi="Times New Roman" w:cs="Times New Roman"/>
-          <w:color w:val="000000"/>
-          <w:sz w:val="22"/>
-          <w:szCs w:val="22"/>
-        </w:rPr>
-        <w:t xml:space="preserve">Agrega getters y </w:t>
-      </w:r>
-      <w:r>
-        <w:rPr>
           <w:rFonts w:ascii="Consolas" w:hAnsi="Consolas" w:cs="Consolas"/>
           <w:color w:val="000000"/>
           <w:sz w:val="22"/>
           <w:szCs w:val="22"/>
         </w:rPr>
-        <w:t xml:space="preserve">setPrecio</w:t>
-      </w:r>
-      <w:r>
-        <w:rPr>
-          <w:rFonts w:ascii="Times New Roman" w:hAnsi="Times New Roman" w:cs="Times New Roman"/>
-          <w:color w:val="000000"/>
-          <w:sz w:val="22"/>
-          <w:szCs w:val="22"/>
-        </w:rPr>
-        <w:t xml:space="preserve"> con validación (precio ≥ 0).</w:t>
+        <w:t xml:space="preserve">toString()</w:t>
+      </w:r>
+      <w:r>
+        <w:rPr>
+          <w:rFonts w:ascii="Times New Roman" w:hAnsi="Times New Roman" w:cs="Times New Roman"/>
+          <w:color w:val="000000"/>
+          <w:sz w:val="22"/>
+          <w:szCs w:val="22"/>
+        </w:rPr>
+        <w:t xml:space="preserve"> con </w:t>
+      </w:r>
+      <w:r>
+        <w:rPr>
+          <w:rFonts w:ascii="Consolas" w:hAnsi="Consolas" w:cs="Consolas"/>
+          <w:color w:val="000000"/>
+          <w:sz w:val="22"/>
+          <w:szCs w:val="22"/>
+        </w:rPr>
+        <w:t xml:space="preserve">@Override</w:t>
+      </w:r>
+      <w:r>
+        <w:rPr>
+          <w:rFonts w:ascii="Times New Roman" w:hAnsi="Times New Roman" w:cs="Times New Roman"/>
+          <w:color w:val="000000"/>
+          <w:sz w:val="22"/>
+          <w:szCs w:val="22"/>
+        </w:rPr>
+        <w:t xml:space="preserve"> para una salida legible.</w:t>
       </w:r>
     </w:p>
     <w:p>
@@ -715,30 +824,58 @@
       </w:r>
       <w:r>
         <w:rPr>
-          <w:rFonts w:ascii="Times New Roman" w:hAnsi="Times New Roman" w:cs="Times New Roman"/>
-          <w:color w:val="000000"/>
-          <w:sz w:val="22"/>
-          <w:szCs w:val="22"/>
-        </w:rPr>
-        <w:t xml:space="preserve">Sobrescribe </w:t>
-      </w:r>
-      <w:r>
-        <w:rPr>
           <w:rFonts w:ascii="Consolas" w:hAnsi="Consolas" w:cs="Consolas"/>
           <w:color w:val="000000"/>
           <w:sz w:val="22"/>
           <w:szCs w:val="22"/>
         </w:rPr>
-        <w:t xml:space="preserve">toString()</w:t>
-      </w:r>
-      <w:r>
-        <w:rPr>
-          <w:rFonts w:ascii="Times New Roman" w:hAnsi="Times New Roman" w:cs="Times New Roman"/>
-          <w:color w:val="000000"/>
-          <w:sz w:val="22"/>
-          <w:szCs w:val="22"/>
-        </w:rPr>
-        <w:t xml:space="preserve"> para una salida legible.</w:t>
+        <w:t xml:space="preserve">equals</w:t>
+      </w:r>
+      <w:r>
+        <w:rPr>
+          <w:rFonts w:ascii="Times New Roman" w:hAnsi="Times New Roman" w:cs="Times New Roman"/>
+          <w:color w:val="000000"/>
+          <w:sz w:val="22"/>
+          <w:szCs w:val="22"/>
+        </w:rPr>
+        <w:t xml:space="preserve">/</w:t>
+      </w:r>
+      <w:r>
+        <w:rPr>
+          <w:rFonts w:ascii="Consolas" w:hAnsi="Consolas" w:cs="Consolas"/>
+          <w:color w:val="000000"/>
+          <w:sz w:val="22"/>
+          <w:szCs w:val="22"/>
+        </w:rPr>
+        <w:t xml:space="preserve">hashCode</w:t>
+      </w:r>
+      <w:r>
+        <w:rPr>
+          <w:rFonts w:ascii="Times New Roman" w:hAnsi="Times New Roman" w:cs="Times New Roman"/>
+          <w:color w:val="000000"/>
+          <w:sz w:val="22"/>
+          <w:szCs w:val="22"/>
+        </w:rPr>
+        <w:t xml:space="preserve"> </w:t>
+      </w:r>
+      <w:r>
+        <w:rPr>
+          <w:rFonts w:ascii="Times New Roman" w:hAnsi="Times New Roman" w:cs="Times New Roman"/>
+          <w:b/>
+          <w:color w:val="000000"/>
+          <w:sz w:val="22"/>
+          <w:szCs w:val="22"/>
+        </w:rPr>
+        <w:t xml:space="preserve">por `codigo`</w:t>
+      </w:r>
+      <w:r>
+        <w:rPr>
+          <w:rFonts w:ascii="Times New Roman" w:hAnsi="Times New Roman" w:cs="Times New Roman"/>
+          <w:color w:val="000000"/>
+          <w:sz w:val="22"/>
+          <w:szCs w:val="22"/>
+        </w:rPr>
+        <w:t xml:space="preserve"> (dos productos con el mismo código son "iguales").</w:t>
       </w:r>
     </w:p>
     <w:p>
@@ -771,16 +908,89 @@
           <w:sz w:val="22"/>
           <w:szCs w:val="22"/>
         </w:rPr>
-        <w:t xml:space="preserve">main</w:t>
-      </w:r>
-      <w:r>
-        <w:rPr>
-          <w:rFonts w:ascii="Times New Roman" w:hAnsi="Times New Roman" w:cs="Times New Roman"/>
-          <w:color w:val="000000"/>
-          <w:sz w:val="22"/>
-          <w:szCs w:val="22"/>
-        </w:rPr>
-        <w:t xml:space="preserve">, crea 3 productos e imprímelos.</w:t>
+        <w:t xml:space="preserve">Main</w:t>
+      </w:r>
+      <w:r>
+        <w:rPr>
+          <w:rFonts w:ascii="Times New Roman" w:hAnsi="Times New Roman" w:cs="Times New Roman"/>
+          <w:color w:val="000000"/>
+          <w:sz w:val="22"/>
+          <w:szCs w:val="22"/>
+        </w:rPr>
+        <w:t xml:space="preserve">: crea productos, imprímelos, compara dos con el mismo código (</w:t>
+      </w:r>
+      <w:r>
+        <w:rPr>
+          <w:rFonts w:ascii="Consolas" w:hAnsi="Consolas" w:cs="Consolas"/>
+          <w:color w:val="000000"/>
+          <w:sz w:val="22"/>
+          <w:szCs w:val="22"/>
+        </w:rPr>
+        <w:t xml:space="preserve">equals</w:t>
+      </w:r>
+      <w:r>
+        <w:rPr>
+          <w:rFonts w:ascii="Times New Roman" w:hAnsi="Times New Roman" w:cs="Times New Roman"/>
+          <w:color w:val="000000"/>
+          <w:sz w:val="22"/>
+          <w:szCs w:val="22"/>
+        </w:rPr>
+        <w:t xml:space="preserve"> → </w:t>
+      </w:r>
+      <w:r>
+        <w:rPr>
+          <w:rFonts w:ascii="Consolas" w:hAnsi="Consolas" w:cs="Consolas"/>
+          <w:color w:val="000000"/>
+          <w:sz w:val="22"/>
+          <w:szCs w:val="22"/>
+        </w:rPr>
+        <w:t xml:space="preserve">true</w:t>
+      </w:r>
+      <w:r>
+        <w:rPr>
+          <w:rFonts w:ascii="Times New Roman" w:hAnsi="Times New Roman" w:cs="Times New Roman"/>
+          <w:color w:val="000000"/>
+          <w:sz w:val="22"/>
+          <w:szCs w:val="22"/>
+        </w:rPr>
+        <w:t xml:space="preserve">) y agrégalos a un </w:t>
+      </w:r>
+      <w:r>
+        <w:rPr>
+          <w:rFonts w:ascii="Consolas" w:hAnsi="Consolas" w:cs="Consolas"/>
+          <w:color w:val="000000"/>
+          <w:sz w:val="22"/>
+          <w:szCs w:val="22"/>
+        </w:rPr>
+        <w:t xml:space="preserve">HashSet&lt;Producto&gt;</w:t>
+      </w:r>
+      <w:r>
+        <w:rPr>
+          <w:rFonts w:ascii="Times New Roman" w:hAnsi="Times New Roman" w:cs="Times New Roman"/>
+          <w:color w:val="000000"/>
+          <w:sz w:val="22"/>
+          <w:szCs w:val="22"/>
+        </w:rPr>
+        <w:t xml:space="preserve"> para evidenciar que </w:t>
+      </w:r>
+      <w:r>
+        <w:rPr>
+          <w:rFonts w:ascii="Times New Roman" w:hAnsi="Times New Roman" w:cs="Times New Roman"/>
+          <w:b/>
+          <w:color w:val="000000"/>
+          <w:sz w:val="22"/>
+          <w:szCs w:val="22"/>
+        </w:rPr>
+        <w:t xml:space="preserve">no se duplican</w:t>
+      </w:r>
+      <w:r>
+        <w:rPr>
+          <w:rFonts w:ascii="Times New Roman" w:hAnsi="Times New Roman" w:cs="Times New Roman"/>
+          <w:color w:val="000000"/>
+          <w:sz w:val="22"/>
+          <w:szCs w:val="22"/>
+        </w:rPr>
+        <w:t xml:space="preserve">.</w:t>
       </w:r>
     </w:p>
     <w:p>
@@ -823,7 +1033,43 @@
           <w:sz w:val="22"/>
           <w:szCs w:val="22"/>
         </w:rPr>
-        <w:t xml:space="preserve">Atributos privados + encapsulamiento.</w:t>
+        <w:t xml:space="preserve">Encapsulamiento + </w:t>
+      </w:r>
+      <w:r>
+        <w:rPr>
+          <w:rFonts w:ascii="Consolas" w:hAnsi="Consolas" w:cs="Consolas"/>
+          <w:color w:val="000000"/>
+          <w:sz w:val="22"/>
+          <w:szCs w:val="22"/>
+        </w:rPr>
+        <w:t xml:space="preserve">final</w:t>
+      </w:r>
+      <w:r>
+        <w:rPr>
+          <w:rFonts w:ascii="Times New Roman" w:hAnsi="Times New Roman" w:cs="Times New Roman"/>
+          <w:color w:val="000000"/>
+          <w:sz w:val="22"/>
+          <w:szCs w:val="22"/>
+        </w:rPr>
+        <w:t xml:space="preserve"> en </w:t>
+      </w:r>
+      <w:r>
+        <w:rPr>
+          <w:rFonts w:ascii="Consolas" w:hAnsi="Consolas" w:cs="Consolas"/>
+          <w:color w:val="000000"/>
+          <w:sz w:val="22"/>
+          <w:szCs w:val="22"/>
+        </w:rPr>
+        <w:t xml:space="preserve">codigo</w:t>
+      </w:r>
+      <w:r>
+        <w:rPr>
+          <w:rFonts w:ascii="Times New Roman" w:hAnsi="Times New Roman" w:cs="Times New Roman"/>
+          <w:color w:val="000000"/>
+          <w:sz w:val="22"/>
+          <w:szCs w:val="22"/>
+        </w:rPr>
+        <w:t xml:space="preserve">.</w:t>
       </w:r>
     </w:p>
     <w:p>
@@ -842,15 +1088,6 @@
       </w:r>
       <w:r>
         <w:rPr>
-          <w:rFonts w:ascii="Times New Roman" w:hAnsi="Times New Roman" w:cs="Times New Roman"/>
-          <w:color w:val="000000"/>
-          <w:sz w:val="22"/>
-          <w:szCs w:val="22"/>
-        </w:rPr>
-        <w:t xml:space="preserve">Dos constructores (uno reutiliza al otro con </w:t>
-      </w:r>
-      <w:r>
-        <w:rPr>
           <w:rFonts w:ascii="Consolas" w:hAnsi="Consolas" w:cs="Consolas"/>
           <w:color w:val="000000"/>
           <w:sz w:val="22"/>
@@ -865,7 +1102,7 @@
           <w:sz w:val="22"/>
           <w:szCs w:val="22"/>
         </w:rPr>
-        <w:t xml:space="preserve">).</w:t>
+        <w:t xml:space="preserve"> entre constructores + validación.</w:t>
       </w:r>
     </w:p>
     <w:p>
@@ -889,16 +1126,16 @@
           <w:sz w:val="22"/>
           <w:szCs w:val="22"/>
         </w:rPr>
-        <w:t xml:space="preserve">toString()</w:t>
-      </w:r>
-      <w:r>
-        <w:rPr>
-          <w:rFonts w:ascii="Times New Roman" w:hAnsi="Times New Roman" w:cs="Times New Roman"/>
-          <w:color w:val="000000"/>
-          <w:sz w:val="22"/>
-          <w:szCs w:val="22"/>
-        </w:rPr>
-        <w:t xml:space="preserve"> con </w:t>
+        <w:t xml:space="preserve">equals</w:t>
+      </w:r>
+      <w:r>
+        <w:rPr>
+          <w:rFonts w:ascii="Times New Roman" w:hAnsi="Times New Roman" w:cs="Times New Roman"/>
+          <w:color w:val="000000"/>
+          <w:sz w:val="22"/>
+          <w:szCs w:val="22"/>
+        </w:rPr>
+        <w:t xml:space="preserve"> y </w:t>
       </w:r>
       <w:r>
         <w:rPr>
@@ -907,7 +1144,67 @@
           <w:sz w:val="22"/>
           <w:szCs w:val="22"/>
         </w:rPr>
+        <w:t xml:space="preserve">hashCode</w:t>
+      </w:r>
+      <w:r>
+        <w:rPr>
+          <w:rFonts w:ascii="Times New Roman" w:hAnsi="Times New Roman" w:cs="Times New Roman"/>
+          <w:color w:val="000000"/>
+          <w:sz w:val="22"/>
+          <w:szCs w:val="22"/>
+        </w:rPr>
+        <w:t xml:space="preserve"> coherentes (mismos campos), con </w:t>
+      </w:r>
+      <w:r>
+        <w:rPr>
+          <w:rFonts w:ascii="Consolas" w:hAnsi="Consolas" w:cs="Consolas"/>
+          <w:color w:val="000000"/>
+          <w:sz w:val="22"/>
+          <w:szCs w:val="22"/>
+        </w:rPr>
         <w:t xml:space="preserve">@Override</w:t>
+      </w:r>
+      <w:r>
+        <w:rPr>
+          <w:rFonts w:ascii="Times New Roman" w:hAnsi="Times New Roman" w:cs="Times New Roman"/>
+          <w:color w:val="000000"/>
+          <w:sz w:val="22"/>
+          <w:szCs w:val="22"/>
+        </w:rPr>
+        <w:t xml:space="preserve">.</w:t>
+      </w:r>
+    </w:p>
+    <w:p>
+      <w:pPr>
+        <w:spacing w:after="120" w:line="276" w:lineRule="auto"/>
+        <w:ind w:left="454" w:hanging="284"/>
+      </w:pPr>
+      <w:r>
+        <w:rPr>
+          <w:rFonts w:ascii="Times New Roman" w:hAnsi="Times New Roman" w:cs="Times New Roman"/>
+          <w:color w:val="000000"/>
+          <w:sz w:val="22"/>
+          <w:szCs w:val="22"/>
+        </w:rPr>
+        <w:t xml:space="preserve">•	</w:t>
+      </w:r>
+      <w:r>
+        <w:rPr>
+          <w:rFonts w:ascii="Times New Roman" w:hAnsi="Times New Roman" w:cs="Times New Roman"/>
+          <w:color w:val="000000"/>
+          <w:sz w:val="22"/>
+          <w:szCs w:val="22"/>
+        </w:rPr>
+        <w:t xml:space="preserve">Prueba con </w:t>
+      </w:r>
+      <w:r>
+        <w:rPr>
+          <w:rFonts w:ascii="Consolas" w:hAnsi="Consolas" w:cs="Consolas"/>
+          <w:color w:val="000000"/>
+          <w:sz w:val="22"/>
+          <w:szCs w:val="22"/>
+        </w:rPr>
+        <w:t xml:space="preserve">HashSet</w:t>
       </w:r>
       <w:r>
         <w:rPr>
@@ -1019,7 +1316,7 @@
           <w:sz w:val="18"/>
           <w:szCs w:val="18"/>
         </w:rPr>
-        <w:t xml:space="preserve">  README.md   -&gt; salida de ejemplo</w:t>
+        <w:t xml:space="preserve">  README.md   -&gt; salida + demostracion de equals/HashSet</w:t>
       </w:r>
     </w:p>
     <w:p>
@@ -1059,7 +1356,7 @@
           <w:sz w:val="22"/>
           <w:szCs w:val="22"/>
         </w:rPr>
-        <w:t xml:space="preserve">Crea el repo público con ese nombre.</w:t>
+        <w:t xml:space="preserve">Crea el repositorio público con ese nombre.</w:t>
       </w:r>
     </w:p>
     <w:p>
@@ -1107,7 +1404,7 @@
           <w:sz w:val="22"/>
           <w:szCs w:val="22"/>
         </w:rPr>
-        <w:t xml:space="preserve">Comparte el enlace por el canal indicado.</w:t>
+        <w:t xml:space="preserve">Comparte el enlace por el canal indicado por el docente.</w:t>
       </w:r>
     </w:p>
     <w:p>
@@ -1190,7 +1487,7 @@
                 <w:sz w:val="20"/>
                 <w:szCs w:val="20"/>
               </w:rPr>
-              <w:t xml:space="preserve">Excelente</w:t>
+              <w:t xml:space="preserve">Excelente (100%)</w:t>
             </w:r>
           </w:p>
         </w:tc>
@@ -1212,7 +1509,7 @@
                 <w:sz w:val="20"/>
                 <w:szCs w:val="20"/>
               </w:rPr>
-              <w:t xml:space="preserve">Aceptable</w:t>
+              <w:t xml:space="preserve">Aceptable (60%)</w:t>
             </w:r>
           </w:p>
         </w:tc>
@@ -1234,7 +1531,7 @@
                 <w:sz w:val="20"/>
                 <w:szCs w:val="20"/>
               </w:rPr>
-              <w:t xml:space="preserve">Por mejorar</w:t>
+              <w:t xml:space="preserve">Por mejorar (0%)</w:t>
             </w:r>
           </w:p>
         </w:tc>
@@ -1278,7 +1575,7 @@
                 <w:sz w:val="20"/>
                 <w:szCs w:val="20"/>
               </w:rPr>
-              <w:t xml:space="preserve">Constructores (con this())</w:t>
+              <w:t xml:space="preserve">Constructores (this() + validación)</w:t>
             </w:r>
           </w:p>
         </w:tc>
@@ -1358,7 +1655,7 @@
                 <w:sz w:val="20"/>
                 <w:szCs w:val="20"/>
               </w:rPr>
-              <w:t xml:space="preserve">30</w:t>
+              <w:t xml:space="preserve">25</w:t>
             </w:r>
           </w:p>
         </w:tc>
@@ -1380,7 +1677,7 @@
                 <w:sz w:val="20"/>
                 <w:szCs w:val="20"/>
               </w:rPr>
-              <w:t xml:space="preserve">Encapsulamiento + validación</w:t>
+              <w:t xml:space="preserve">Encapsulamiento + codigo final</w:t>
             </w:r>
           </w:p>
         </w:tc>
@@ -1460,7 +1757,7 @@
                 <w:sz w:val="20"/>
                 <w:szCs w:val="20"/>
               </w:rPr>
-              <w:t xml:space="preserve">30</w:t>
+              <w:t xml:space="preserve">20</w:t>
             </w:r>
           </w:p>
         </w:tc>
@@ -1482,7 +1779,7 @@
                 <w:sz w:val="20"/>
                 <w:szCs w:val="20"/>
               </w:rPr>
-              <w:t xml:space="preserve">toString()</w:t>
+              <w:t xml:space="preserve">toString</w:t>
             </w:r>
           </w:p>
         </w:tc>
@@ -1502,7 +1799,7 @@
                 <w:sz w:val="20"/>
                 <w:szCs w:val="20"/>
               </w:rPr>
-              <w:t xml:space="preserve">Correcto</w:t>
+              <w:t xml:space="preserve">Claro y con @Override</w:t>
             </w:r>
           </w:p>
         </w:tc>
@@ -1562,7 +1859,7 @@
                 <w:sz w:val="20"/>
                 <w:szCs w:val="20"/>
               </w:rPr>
-              <w:t xml:space="preserve">25</w:t>
+              <w:t xml:space="preserve">15</w:t>
             </w:r>
           </w:p>
         </w:tc>
@@ -1584,6 +1881,108 @@
                 <w:sz w:val="20"/>
                 <w:szCs w:val="20"/>
               </w:rPr>
+              <w:t xml:space="preserve">equals + hashCode (contrato)</w:t>
+            </w:r>
+          </w:p>
+        </w:tc>
+        <w:tc>
+          <w:tcPr>
+            <w:tcW w:w="0" w:type="auto"/>
+            <w:vAlign w:val="center"/>
+          </w:tcPr>
+          <w:p>
+            <w:pPr>
+              <w:spacing w:after="20" w:before="20"/>
+            </w:pPr>
+            <w:r>
+              <w:rPr>
+                <w:rFonts w:ascii="Times New Roman" w:hAnsi="Times New Roman" w:cs="Times New Roman"/>
+                <w:color w:val="000000"/>
+                <w:sz w:val="20"/>
+                <w:szCs w:val="20"/>
+              </w:rPr>
+              <w:t xml:space="preserve">Coherentes y probados con HashSet</w:t>
+            </w:r>
+          </w:p>
+        </w:tc>
+        <w:tc>
+          <w:tcPr>
+            <w:tcW w:w="0" w:type="auto"/>
+            <w:vAlign w:val="center"/>
+          </w:tcPr>
+          <w:p>
+            <w:pPr>
+              <w:spacing w:after="20" w:before="20"/>
+            </w:pPr>
+            <w:r>
+              <w:rPr>
+                <w:rFonts w:ascii="Times New Roman" w:hAnsi="Times New Roman" w:cs="Times New Roman"/>
+                <w:color w:val="000000"/>
+                <w:sz w:val="20"/>
+                <w:szCs w:val="20"/>
+              </w:rPr>
+              <w:t xml:space="preserve">Uno o sin probar</w:t>
+            </w:r>
+          </w:p>
+        </w:tc>
+        <w:tc>
+          <w:tcPr>
+            <w:tcW w:w="0" w:type="auto"/>
+            <w:vAlign w:val="center"/>
+          </w:tcPr>
+          <w:p>
+            <w:pPr>
+              <w:spacing w:after="20" w:before="20"/>
+            </w:pPr>
+            <w:r>
+              <w:rPr>
+                <w:rFonts w:ascii="Times New Roman" w:hAnsi="Times New Roman" w:cs="Times New Roman"/>
+                <w:color w:val="000000"/>
+                <w:sz w:val="20"/>
+                <w:szCs w:val="20"/>
+              </w:rPr>
+              <w:t xml:space="preserve">Incorrectos</w:t>
+            </w:r>
+          </w:p>
+        </w:tc>
+        <w:tc>
+          <w:tcPr>
+            <w:tcW w:w="0" w:type="auto"/>
+            <w:vAlign w:val="center"/>
+          </w:tcPr>
+          <w:p>
+            <w:pPr>
+              <w:spacing w:after="20" w:before="20"/>
+            </w:pPr>
+            <w:r>
+              <w:rPr>
+                <w:rFonts w:ascii="Times New Roman" w:hAnsi="Times New Roman" w:cs="Times New Roman"/>
+                <w:color w:val="000000"/>
+                <w:sz w:val="20"/>
+                <w:szCs w:val="20"/>
+              </w:rPr>
+              <w:t xml:space="preserve">30</w:t>
+            </w:r>
+          </w:p>
+        </w:tc>
+      </w:tr>
+      <w:tr>
+        <w:tc>
+          <w:tcPr>
+            <w:tcW w:w="0" w:type="auto"/>
+            <w:vAlign w:val="center"/>
+          </w:tcPr>
+          <w:p>
+            <w:pPr>
+              <w:spacing w:after="20" w:before="20"/>
+            </w:pPr>
+            <w:r>
+              <w:rPr>
+                <w:rFonts w:ascii="Times New Roman" w:hAnsi="Times New Roman" w:cs="Times New Roman"/>
+                <w:color w:val="000000"/>
+                <w:sz w:val="20"/>
+                <w:szCs w:val="20"/>
+              </w:rPr>
               <w:t xml:space="preserve">README y repositorio</w:t>
             </w:r>
           </w:p>
@@ -1664,7 +2063,7 @@
                 <w:sz w:val="20"/>
                 <w:szCs w:val="20"/>
               </w:rPr>
-              <w:t xml:space="preserve">15</w:t>
+              <w:t xml:space="preserve">10</w:t>
             </w:r>
           </w:p>
         </w:tc>
@@ -1683,7 +2082,7 @@
           <w:sz w:val="21"/>
           <w:szCs w:val="21"/>
         </w:rPr>
-        <w:t xml:space="preserve">Nota: actividad formativa y opcional (sin nota en Moodle). La guía unificada de entrega estará en el Manual de Entrega de Actividades Opcionales (próximamente).</w:t>
+        <w:t xml:space="preserve">Nota: actividad formativa y opcional (sin nota en Moodle). La guía unificada para entregar todas las actividades opcionales, válida para todas las materias, estará en el Manual de Entrega de Actividades Opcionales (próximamente).</w:t>
       </w:r>
     </w:p>
     <w:sectPr>

</xml_diff>